<commit_message>
added some content to branches.docx
</commit_message>
<xml_diff>
--- a/git/branches.docx
+++ b/git/branches.docx
@@ -5,64 +5,130 @@
     <w:p>
       <w:pPr>
         <w:rPr>
-          <w:lang w:val="en-US"/>
-        </w:rPr>
-      </w:pPr>
-      <w:r>
-        <w:rPr>
-          <w:lang w:val="en-US"/>
-        </w:rPr>
-        <w:t>-&gt;staging area is shared across all the branches in a repository</w:t>
-      </w:r>
-    </w:p>
-    <w:p>
-      <w:pPr>
-        <w:rPr>
-          <w:lang w:val="en-US"/>
-        </w:rPr>
-      </w:pPr>
-      <w:r>
-        <w:rPr>
-          <w:lang w:val="en-US"/>
-        </w:rPr>
-        <w:t xml:space="preserve">-&gt;branches in </w:t>
-      </w:r>
-      <w:proofErr w:type="spellStart"/>
-      <w:r>
-        <w:rPr>
-          <w:lang w:val="en-US"/>
-        </w:rPr>
-        <w:t>git</w:t>
-      </w:r>
-      <w:proofErr w:type="spellEnd"/>
-      <w:r>
-        <w:rPr>
-          <w:lang w:val="en-US"/>
-        </w:rPr>
-        <w:t xml:space="preserve"> track commits made in respective branches </w:t>
-      </w:r>
-    </w:p>
-    <w:p>
-      <w:pPr>
-        <w:rPr>
-          <w:lang w:val="en-US"/>
-        </w:rPr>
-      </w:pPr>
-      <w:r>
-        <w:rPr>
-          <w:lang w:val="en-US"/>
-        </w:rPr>
-        <w:t>-&gt;the staging area and working directory are not branch specific.</w:t>
-      </w:r>
-    </w:p>
-    <w:p>
-      <w:pPr>
-        <w:rPr>
-          <w:lang w:val="en-US"/>
-        </w:rPr>
-      </w:pPr>
+          <w:u w:val="single"/>
+          <w:lang w:val="en-US"/>
+        </w:rPr>
+      </w:pPr>
+      <w:r>
+        <w:rPr>
+          <w:u w:val="single"/>
+          <w:lang w:val="en-US"/>
+        </w:rPr>
+        <w:t>BASIC COMMANDS:</w:t>
+      </w:r>
+    </w:p>
+    <w:p>
+      <w:pPr>
+        <w:rPr>
+          <w:lang w:val="en-US"/>
+        </w:rPr>
+      </w:pPr>
+      <w:r>
+        <w:rPr>
+          <w:lang w:val="en-US"/>
+        </w:rPr>
+        <w:t>Git branch &lt;branchname&gt; : creates a branch</w:t>
+      </w:r>
+    </w:p>
+    <w:p>
+      <w:pPr>
+        <w:rPr>
+          <w:lang w:val="en-US"/>
+        </w:rPr>
+      </w:pPr>
+      <w:r>
+        <w:rPr>
+          <w:lang w:val="en-US"/>
+        </w:rPr>
+        <w:t>Git switch &lt;branchname&gt; : switches branches</w:t>
+      </w:r>
+    </w:p>
+    <w:p>
+      <w:pPr>
+        <w:rPr>
+          <w:lang w:val="en-US"/>
+        </w:rPr>
+      </w:pPr>
+      <w:r>
+        <w:rPr>
+          <w:lang w:val="en-US"/>
+        </w:rPr>
+        <w:t>Git branch –d &lt;branchname&gt; : deletes a branch</w:t>
+      </w:r>
+    </w:p>
+    <w:p>
+      <w:pPr>
+        <w:rPr>
+          <w:lang w:val="en-US"/>
+        </w:rPr>
+      </w:pPr>
+      <w:r>
+        <w:rPr>
+          <w:lang w:val="en-US"/>
+        </w:rPr>
+        <w:t>Git merge &lt;branchname&gt;:</w:t>
+      </w:r>
+      <w:r>
+        <w:rPr>
+          <w:lang w:val="en-US"/>
+        </w:rPr>
+        <w:t xml:space="preserve"> : merges branches with the current branch</w:t>
+      </w:r>
       <w:bookmarkStart w:id="0" w:name="_GoBack"/>
       <w:bookmarkEnd w:id="0"/>
+    </w:p>
+    <w:p>
+      <w:pPr>
+        <w:rPr>
+          <w:lang w:val="en-US"/>
+        </w:rPr>
+      </w:pPr>
+    </w:p>
+    <w:p>
+      <w:pPr>
+        <w:rPr>
+          <w:lang w:val="en-US"/>
+        </w:rPr>
+      </w:pPr>
+      <w:r>
+        <w:rPr>
+          <w:lang w:val="en-US"/>
+        </w:rPr>
+        <w:t>-&gt;staging area is shared across all the branches in a repository</w:t>
+      </w:r>
+    </w:p>
+    <w:p>
+      <w:pPr>
+        <w:rPr>
+          <w:lang w:val="en-US"/>
+        </w:rPr>
+      </w:pPr>
+      <w:r>
+        <w:rPr>
+          <w:lang w:val="en-US"/>
+        </w:rPr>
+        <w:t xml:space="preserve">-&gt;branches in git track commits made in respective branches </w:t>
+      </w:r>
+    </w:p>
+    <w:p>
+      <w:pPr>
+        <w:rPr>
+          <w:lang w:val="en-US"/>
+        </w:rPr>
+      </w:pPr>
+      <w:r>
+        <w:rPr>
+          <w:lang w:val="en-US"/>
+        </w:rPr>
+        <w:t>-&gt;the staging area and working directory are not branch specific.</w:t>
+      </w:r>
+    </w:p>
+    <w:p>
+      <w:pPr>
+        <w:rPr>
+          <w:lang w:val="en-US"/>
+        </w:rPr>
+      </w:pPr>
     </w:p>
     <w:sectPr>
       <w:headerReference w:type="default" r:id="rId6"/>

</xml_diff>